<commit_message>
Dejo el punto 3 del trabajo donde contesto las preguntas en base a las pruebas realizadas en la función b
</commit_message>
<xml_diff>
--- a/Diseñar casos de pruebas.docx
+++ b/Diseñar casos de pruebas.docx
@@ -25,10 +25,7 @@
         <w:t>1.</w:t>
       </w:r>
       <w:r>
-        <w:t>a</w:t>
-      </w:r>
-      <w:r>
-        <w:t xml:space="preserve">) </w:t>
+        <w:t xml:space="preserve">a) </w:t>
       </w:r>
       <w:r>
         <w:t>Calcular el total de un presupuesto:</w:t>
@@ -168,16 +165,7 @@
               <w:t xml:space="preserve"> </w:t>
             </w:r>
             <w:r>
-              <w:t>con 15 %</w:t>
-            </w:r>
-            <w:r>
-              <w:t xml:space="preserve"> de</w:t>
-            </w:r>
-            <w:r>
-              <w:t xml:space="preserve"> descuento</w:t>
-            </w:r>
-            <w:r>
-              <w:t>.</w:t>
+              <w:t>con 15 % de descuento.</w:t>
             </w:r>
           </w:p>
         </w:tc>
@@ -219,19 +207,7 @@
           </w:tcPr>
           <w:p>
             <w:r>
-              <w:t xml:space="preserve">Que </w:t>
-            </w:r>
-            <w:r>
-              <w:t>tire</w:t>
-            </w:r>
-            <w:r>
-              <w:t xml:space="preserve"> bien el total con </w:t>
-            </w:r>
-            <w:r>
-              <w:t>el 25%</w:t>
-            </w:r>
-            <w:r>
-              <w:t xml:space="preserve"> descuento.</w:t>
+              <w:t>Que tire bien el total con el 25% descuento.</w:t>
             </w:r>
           </w:p>
         </w:tc>
@@ -285,13 +261,7 @@
           </w:tcPr>
           <w:p>
             <w:r>
-              <w:t xml:space="preserve">Descuento del </w:t>
-            </w:r>
-            <w:r>
-              <w:t>10</w:t>
-            </w:r>
-            <w:r>
-              <w:t>0%.</w:t>
+              <w:t>Descuento del 100%.</w:t>
             </w:r>
           </w:p>
         </w:tc>
@@ -301,10 +271,7 @@
           </w:tcPr>
           <w:p>
             <w:r>
-              <w:t>Que aplique el descuento completo</w:t>
-            </w:r>
-            <w:r>
-              <w:t>.</w:t>
+              <w:t>Que aplique el descuento completo.</w:t>
             </w:r>
           </w:p>
         </w:tc>
@@ -411,13 +378,7 @@
           </w:tcPr>
           <w:p>
             <w:r>
-              <w:t xml:space="preserve">Que haga bien la cuenta con un descuento </w:t>
-            </w:r>
-            <w:r>
-              <w:t>del 99%</w:t>
-            </w:r>
-            <w:r>
-              <w:t>.</w:t>
+              <w:t>Que haga bien la cuenta con un descuento del 99%.</w:t>
             </w:r>
           </w:p>
         </w:tc>
@@ -459,16 +420,7 @@
           </w:tcPr>
           <w:p>
             <w:r>
-              <w:t>No puede</w:t>
-            </w:r>
-            <w:r>
-              <w:t xml:space="preserve"> aplicar un descuento menor </w:t>
-            </w:r>
-            <w:r>
-              <w:t xml:space="preserve">al </w:t>
-            </w:r>
-            <w:r>
-              <w:t>0%.</w:t>
+              <w:t>No puede aplicar un descuento menor al 0%.</w:t>
             </w:r>
           </w:p>
         </w:tc>
@@ -857,13 +809,7 @@
               <w:t>Poder poner</w:t>
             </w:r>
             <w:r>
-              <w:t xml:space="preserve"> un número de </w:t>
-            </w:r>
-            <w:r>
-              <w:t>14</w:t>
-            </w:r>
-            <w:r>
-              <w:t xml:space="preserve"> dígitos.</w:t>
+              <w:t xml:space="preserve"> un número de 14 dígitos.</w:t>
             </w:r>
           </w:p>
         </w:tc>
@@ -1097,16 +1043,7 @@
               <w:t xml:space="preserve">Que rechace un cliente </w:t>
             </w:r>
             <w:r>
-              <w:t>que no tenga</w:t>
-            </w:r>
-            <w:r>
-              <w:t xml:space="preserve"> el nombre</w:t>
-            </w:r>
-            <w:r>
-              <w:t xml:space="preserve"> puest</w:t>
-            </w:r>
-            <w:r>
-              <w:t>o</w:t>
+              <w:t>que no tenga el nombre puesto</w:t>
             </w:r>
             <w:r>
               <w:t>.</w:t>
@@ -1251,8 +1188,50 @@
       </w:tr>
     </w:tbl>
     <w:p>
+      <w:r>
+        <w:lastRenderedPageBreak/>
+        <w:t>Realice los test sobre la función b. A partir de esa función contesto las siguientes preguntas:</w:t>
+      </w:r>
       <w:bookmarkStart w:id="0" w:name="_GoBack"/>
       <w:bookmarkEnd w:id="0"/>
+    </w:p>
+    <w:p>
+      <w:r>
+        <w:t>3.1)</w:t>
+      </w:r>
+      <w:r>
+        <w:t xml:space="preserve"> </w:t>
+      </w:r>
+      <w:r>
+        <w:t xml:space="preserve">No, ninguno de los </w:t>
+      </w:r>
+      <w:proofErr w:type="spellStart"/>
+      <w:r>
+        <w:t>tests</w:t>
+      </w:r>
+      <w:proofErr w:type="spellEnd"/>
+      <w:r>
+        <w:t xml:space="preserve"> encontró errores, ya que todos pasaron correctamente al ejecutar </w:t>
+      </w:r>
+      <w:proofErr w:type="spellStart"/>
+      <w:r>
+        <w:t>pytest</w:t>
+      </w:r>
+      <w:proofErr w:type="spellEnd"/>
+      <w:r>
+        <w:t>.</w:t>
+      </w:r>
+    </w:p>
+    <w:p>
+      <w:r>
+        <w:t>2)</w:t>
+      </w:r>
+      <w:r>
+        <w:t xml:space="preserve"> </w:t>
+      </w:r>
+      <w:r>
+        <w:t>Para mí, el caso más importante es comprobar que se rechace un cliente sin nombre, porque es un dato necesario para poder identificarlo y registrar correctamente sus turnos.</w:t>
+      </w:r>
     </w:p>
     <w:sectPr>
       <w:pgSz w:w="11906" w:h="16838"/>

</xml_diff>